<commit_message>
barlow/finesst: restyle Claude-authored spans to FI voice (no colons/semicolons/em dashes)
10 spans rewritten as plain declarative sentences. Punctuation audit clean,
body still 6 pp. Bolded review copy regenerated from restyled text.

Co-Authored-By: Claude Fable 5 <noreply@anthropic.com>
</commit_message>
<xml_diff>
--- a/barlow/finesst_final_v2/finesst_proposal_v10_changes_bolded.docx
+++ b/barlow/finesst_final_v2/finesst_proposal_v10_changes_bolded.docx
@@ -447,13 +447,13 @@
         <w:rPr>
           <w:b/>
         </w:rPr>
-        <w:t>It spans three of the Division’s research spheres: the Cryosphere (polar glaciers and their meltwater), the Hydrosphere (water moving through the stream network), and the Geosphere (surface-topography change)</w:t>
-      </w:r>
-      <w:r>
-        <w:rPr>
-          <w:b/>
-        </w:rPr>
-        <w:t xml:space="preserve">, all of which address cold-region surface change and meltwater.</w:t>
+        <w:t xml:space="preserve">It spans three of the Division’s research spheres. The Cryosphere covers polar glaciers and their meltwater, the Hydrosphere covers water moving through the stream network, and the Geosphere covers change in surface topography</w:t>
+      </w:r>
+      <w:r>
+        <w:rPr>
+          <w:b/>
+        </w:rPr>
+        <w:t xml:space="preserve">. All three address cold-region surface change and meltwater.</w:t>
       </w:r>
       <w:r>
         <w:t xml:space="preserve"> The </w:t>
@@ -513,7 +513,7 @@
         <w:rPr>
           <w:b/>
         </w:rPr>
-        <w:t xml:space="preserve">NISAR's left-looking, 12-day L-band coverage includes the Dry Valleys [7]; it maps surface deformation and coherence change rather than elevation, so it is a possible independent flag of melt-season bank disturbance, not an elevation source.</w:t>
+        <w:t xml:space="preserve">NISAR's left-looking, 12-day L-band coverage includes the Dry Valleys [7]. It maps surface deformation and coherence change rather than elevation, so it can flag melt-season bank disturbance independently, but it is not an elevation source.</w:t>
       </w:r>
       <w:r>
         <w:t xml:space="preserve"> </w:t>
@@ -584,19 +584,7 @@
         <w:rPr>
           <w:b/>
         </w:rPr>
-        <w:t xml:space="preserve">Candidate controls fall into two groups. Climate forcing — air temperature, incoming sunlight, meltwater discharge, glacial mass balance, and summer thaw — comes from the McMurdo Dry Valleys LTER network [8], with ERA5 [9] and AMPS reanalysis filling coverage gaps. Substrate susceptibility — microclimate zone, mapped permafrost </w:t>
-      </w:r>
-      <w:r>
-        <w:rPr>
-          <w:b/>
-        </w:rPr>
-        <w:t xml:space="preserve">and ground-ice class</w:t>
-      </w:r>
-      <w:r>
-        <w:rPr>
-          <w:b/>
-        </w:rPr>
-        <w:t xml:space="preserve">, and bed material — comes from published MDV mapping [10], [11]. We hypothesize that, after controlling for substrate, melt energy will predict channel change better than water volume alone (H1); forcing should matter most where ground ice is present. The hypothesis is testable: if discharge alone predicts channel migration as well as melt energy does, or if substrate class alone absorbs the explanatory power, the hypothesis fails.</w:t>
+        <w:t xml:space="preserve">Candidate controls fall into two groups. Climate forcing includes air temperature, incoming sunlight, meltwater discharge, glacial mass balance, and summer thaw. These records come from the McMurdo Dry Valleys LTER network [8], with ERA5 [9] and AMPS reanalysis filling coverage gaps. Substrate susceptibility includes microclimate zone, mapped permafrost and ground-ice class, and bed material, drawn from published MDV mapping [10], [11]. We hypothesize that melt energy will predict channel change better than water volume alone after controlling for substrate (H1). Forcing should matter most where ground ice is present. The hypothesis is testable. If discharge alone predicts channel migration as well as melt energy does, or if substrate class alone absorbs the explanatory power, the hypothesis fails.</w:t>
       </w:r>
     </w:p>
     <w:p>
@@ -680,7 +668,7 @@
         <w:rPr>
           <w:b/>
         </w:rPr>
-        <w:t xml:space="preserve"> in terrain-dependent ways; correcting that is part of the method, not a chief objective.</w:t>
+        <w:t xml:space="preserve"> in terrain-dependent ways. Correcting that is part of the method, not a chief objective.</w:t>
       </w:r>
     </w:p>
     <w:p>
@@ -858,7 +846,7 @@
         <w:rPr>
           <w:b/>
         </w:rPr>
-        <w:t xml:space="preserve">Build a driver history for every stream, gauged or not. ERA5 and AMPS reanalysis supply temperature and radiation for every basin; per-basin insolation is computed directly from the project DEMs, with terrain shading; substrate covariates come from published maps and require no field records. The 21 LTER gauge records then calibrate an insolation-to-discharge regression — measured discharge against summer insolation on each gauged stream's source glacier — that estimates discharge for the ungauged streams and for the thin record after 2015. LTER data calibrate and validate the driver set; they do not limit its coverage.</w:t>
+        <w:t xml:space="preserve">Build a driver history for every stream, gauged or not. ERA5 and AMPS reanalysis supply temperature and radiation for every basin. Per-basin insolation is computed from the project DEMs, with terrain shading. Substrate covariates come from published maps and require no field records. The 21 LTER gauge records then calibrate a regression between measured discharge and summer insolation on each gauged stream's source glacier. That regression estimates discharge for the ungauged streams and for the thin record after 2015. LTER data calibrate and validate the driver set, but they do not limit its coverage.</w:t>
       </w:r>
     </w:p>
     <w:p>
@@ -1102,7 +1090,7 @@
         <w:t xml:space="preserve"> [12]</w:t>
       </w:r>
       <w:r>
-        <w:t xml:space="preserve">, since elevation errors here are heavy-tailed and an ordinary standard deviation would be thrown off by a few blunders. The noise scale throughout is the NMAD (1.4826 times the median absolute deviation from the median). For a single surface the detection floor is LOD95 = 1.96 × NMAD; since a difference subtracts two noisy surfaces, their NMADs add in quadrature, so the differencing floor is:</w:t>
+        <w:t xml:space="preserve">, since elevation errors here are heavy-tailed and an ordinary standard deviation would be thrown off by a few blunders. The noise scale throughout is the NMAD (1.4826 times the median absolute deviation from the median). For a single surface the detection floor is LOD95 = 1.96 × NMAD; since a difference subtracts two noisy surfaces, their NMADs add in quadrature, so the differencing floor is</w:t>
       </w:r>
     </w:p>
     <w:p>
@@ -1944,7 +1932,7 @@
         <w:rPr>
           <w:b/>
         </w:rPr>
-        <w:t>The project is designed to keep risk low, and the main threats to the work have been mitigated as far as project design allows. A few could still affect the completeness of the results; each is described below with its mitigation.</w:t>
+        <w:t xml:space="preserve">The project is designed to keep risk low, and the main threats to the work have been mitigated as far as project design allows. A few could still affect the completeness of the results. Each is described below with its mitigation.</w:t>
       </w:r>
     </w:p>
     <w:p>
@@ -2349,7 +2337,7 @@
           <w:b/>
           <w:rFonts w:ascii="Times New Roman" w:hAnsi="Times New Roman"/>
         </w:rPr>
-        <w:t xml:space="preserve">All inputs are public and cited to source; all derived products and processing code</w:t>
+        <w:t xml:space="preserve">All inputs are public and cited to source. All derived products and processing code</w:t>
       </w:r>
       <w:r>
         <w:rPr>
@@ -2362,7 +2350,7 @@
           <w:b/>
           <w:rFonts w:ascii="Times New Roman" w:hAnsi="Times New Roman"/>
         </w:rPr>
-        <w:t xml:space="preserve"> will be released open-access with DOIs (Zenodo / EDI), with formats, archives, and metadata detailed in the accompanying OSDMP.</w:t>
+        <w:t xml:space="preserve"> will be released open-access with DOIs (Zenodo / EDI). Formats, archives, and metadata are detailed in the accompanying OSDMP.</w:t>
       </w:r>
     </w:p>
     <w:p>

</xml_diff>